<commit_message>
Add research walkthrough and publication-ready reports
</commit_message>
<xml_diff>
--- a/report/Equity_Volatility_Research_Report.docx
+++ b/report/Equity_Volatility_Research_Report.docx
@@ -19,7 +19,51 @@
         <w:t xml:space="preserve"> </w:t>
       </w:r>
       <w:r>
-        <w:t xml:space="preserve">Research:</w:t>
+        <w:t xml:space="preserve">Research</w:t>
+      </w:r>
+      <w:r>
+        <w:t xml:space="preserve"> </w:t>
+      </w:r>
+      <w:r>
+        <w:t xml:space="preserve">Pipeline</w:t>
+      </w:r>
+    </w:p>
+    <w:p>
+      <w:pPr>
+        <w:pStyle w:val="Subtitle"/>
+      </w:pPr>
+      <w:r>
+        <w:t xml:space="preserve">Strategy</w:t>
+      </w:r>
+      <w:r>
+        <w:t xml:space="preserve"> </w:t>
+      </w:r>
+      <w:r>
+        <w:t xml:space="preserve">Backtesting,</w:t>
+      </w:r>
+      <w:r>
+        <w:t xml:space="preserve"> </w:t>
+      </w:r>
+      <w:r>
+        <w:t xml:space="preserve">Market</w:t>
+      </w:r>
+      <w:r>
+        <w:t xml:space="preserve"> </w:t>
+      </w:r>
+      <w:r>
+        <w:t xml:space="preserve">Regime</w:t>
+      </w:r>
+      <w:r>
+        <w:t xml:space="preserve"> </w:t>
+      </w:r>
+      <w:r>
+        <w:t xml:space="preserve">Analysis,</w:t>
+      </w:r>
+      <w:r>
+        <w:t xml:space="preserve"> </w:t>
+      </w:r>
+      <w:r>
+        <w:t xml:space="preserve">and</w:t>
       </w:r>
       <w:r>
         <w:t xml:space="preserve"> </w:t>
@@ -31,19 +75,31 @@
         <w:t xml:space="preserve"> </w:t>
       </w:r>
       <w:r>
-        <w:t xml:space="preserve">and</w:t>
-      </w:r>
-      <w:r>
-        <w:t xml:space="preserve"> </w:t>
-      </w:r>
-      <w:r>
-        <w:t xml:space="preserve">Strategy</w:t>
-      </w:r>
-      <w:r>
-        <w:t xml:space="preserve"> </w:t>
-      </w:r>
-      <w:r>
-        <w:t xml:space="preserve">Backtesting</w:t>
+        <w:t xml:space="preserve">with</w:t>
+      </w:r>
+      <w:r>
+        <w:t xml:space="preserve"> </w:t>
+      </w:r>
+      <w:r>
+        <w:t xml:space="preserve">Out-of-Sample</w:t>
+      </w:r>
+      <w:r>
+        <w:t xml:space="preserve"> </w:t>
+      </w:r>
+      <w:r>
+        <w:t xml:space="preserve">Validation</w:t>
+      </w:r>
+      <w:r>
+        <w:t xml:space="preserve"> </w:t>
+      </w:r>
+      <w:r>
+        <w:t xml:space="preserve">in</w:t>
+      </w:r>
+      <w:r>
+        <w:t xml:space="preserve"> </w:t>
+      </w:r>
+      <w:r>
+        <w:t xml:space="preserve">Python</w:t>
       </w:r>
     </w:p>
     <w:p>
@@ -66,32 +122,6 @@
         <w:t xml:space="preserve">Omidiran</w:t>
       </w:r>
     </w:p>
-    <w:sdt>
-      <w:sdtPr>
-        <w:docPartObj>
-          <w:docPartGallery w:val="Table of Contents"/>
-          <w:docPartUnique/>
-        </w:docPartObj>
-      </w:sdtPr>
-      <w:sdtContent>
-        <w:p>
-          <w:pPr>
-            <w:pStyle w:val="TOCHeading"/>
-          </w:pPr>
-          <w:r>
-            <w:t xml:space="preserve">Table of Contents</w:t>
-          </w:r>
-        </w:p>
-        <w:p>
-          <w:r>
-            <w:fldChar w:fldCharType="begin" w:dirty="true"/>
-            <w:instrText xml:space="preserve">TOC \o "1-2" \h \z \u</w:instrText>
-            <w:fldChar w:fldCharType="separate"/>
-            <w:fldChar w:fldCharType="end"/>
-          </w:r>
-        </w:p>
-      </w:sdtContent>
-    </w:sdt>
     <w:bookmarkStart w:id="21" w:name="abstract"/>
     <w:p>
       <w:pPr>
@@ -129,6 +159,11 @@
         <w:t xml:space="preserve">, and a Heterogeneous Autoregressive (HAR) model fitted by least squares on a purged training partition under a supervised-learning protocol. On held-out data the HAR model achieves RMSE of 9.08% against 9.30% for EWMA and 10.28% for the random walk. I also document that the choice of evaluation target reverses model ranking entirely: scoring against a target constructed from overlapping windows makes the naive random walk appear superior by a wide margin.</w:t>
       </w:r>
     </w:p>
+    <w:p>
+      <w:r>
+        <w:br w:type="page"/>
+      </w:r>
+    </w:p>
     <w:bookmarkStart w:id="20" w:name="contents"/>
     <w:p>
       <w:pPr>
@@ -633,6 +668,11 @@
     </w:p>
     <w:bookmarkEnd w:id="20"/>
     <w:bookmarkEnd w:id="21"/>
+    <w:p>
+      <w:r>
+        <w:br w:type="page"/>
+      </w:r>
+    </w:p>
     <w:bookmarkStart w:id="25" w:name="data"/>
     <w:p>
       <w:pPr>
@@ -6825,6 +6865,11 @@
       </w:r>
     </w:p>
     <w:bookmarkEnd w:id="75"/>
+    <w:p>
+      <w:r>
+        <w:br w:type="page"/>
+      </w:r>
+    </w:p>
     <w:bookmarkStart w:id="76" w:name="references"/>
     <w:p>
       <w:pPr>
@@ -6959,6 +7004,11 @@
       </w:r>
     </w:p>
     <w:bookmarkEnd w:id="76"/>
+    <w:p>
+      <w:r>
+        <w:br w:type="page"/>
+      </w:r>
+    </w:p>
     <w:bookmarkStart w:id="77" w:name="appendix-reproduction"/>
     <w:p>
       <w:pPr>

</xml_diff>